<commit_message>
PD Calibration spec: the full analysis (each change on its own, the backtest, the Stage 1 allowance estimate); change 5 now fixes default at 180 days and leaves 90 days to a separate credit-policy decision
Co-Authored-By: Claude Opus 5.5 <noreply@anthropic.com>
</commit_message>
<xml_diff>
--- a/docs/MAIIC_PD_Calibration_Specification_v1_2026-10-16.docx
+++ b/docs/MAIIC_PD_Calibration_Specification_v1_2026-10-16.docx
@@ -1251,7 +1251,7 @@
         <w:pStyle w:val="Heading2"/>
       </w:pPr>
       <w:r>
-        <w:t>5. What a better method gives, on the same data</w:t>
+        <w:t>5. What the changes give, on the same data</w:t>
       </w:r>
     </w:p>
     <w:p>
@@ -1263,7 +1263,1836 @@
           <w:b w:val="0"/>
           <w:i w:val="0"/>
         </w:rPr>
-        <w:t>Two of the changes below, counting loans instead of balance and averaging over all fifteen 12-month windows held (July 2025 to September 2026), applied to the same history:</w:t>
+        <w:t>The analysis below rebuilds every 12-month window from MAIIC's loan-month history (27 months, July 2024 to September 2026; 15 complete windows; 663 Stage 1 and 319 Stage 2 loan-windows) and applies the changes one at a time. Rebuilt with today's method, it gives exactly the engine's own figures, so the starting point is sound.</w:t>
+      </w:r>
+    </w:p>
+    <w:p>
+      <w:pPr>
+        <w:spacing w:after="120"/>
+      </w:pPr>
+      <w:r>
+        <w:rPr>
+          <w:b/>
+          <w:i w:val="0"/>
+        </w:rPr>
+        <w:t>Stage 1 PD, for the window ending September 2026</w:t>
+      </w:r>
+    </w:p>
+    <w:tbl>
+      <w:tblPr>
+        <w:tblStyle w:val="TableGrid"/>
+        <w:tblW w:type="auto" w:w="0"/>
+        <w:tblLook w:firstColumn="1" w:firstRow="1" w:lastColumn="0" w:lastRow="0" w:noHBand="0" w:noVBand="1" w:val="04A0"/>
+      </w:tblPr>
+      <w:tblGrid>
+        <w:gridCol w:w="1662"/>
+        <w:gridCol w:w="1662"/>
+        <w:gridCol w:w="1662"/>
+        <w:gridCol w:w="1662"/>
+        <w:gridCol w:w="1662"/>
+        <w:gridCol w:w="1662"/>
+      </w:tblGrid>
+      <w:tr>
+        <w:tc>
+          <w:tcPr>
+            <w:tcW w:type="dxa" w:w="1662"/>
+            <w:shd w:val="clear" w:color="auto" w:fill="1B2A41"/>
+          </w:tcPr>
+          <w:p>
+            <w:r>
+              <w:rPr>
+                <w:b/>
+                <w:color w:val="FFFFFF"/>
+                <w:sz w:val="17"/>
+              </w:rPr>
+            </w:r>
+            <w:r>
+              <w:rPr>
+                <w:b/>
+                <w:i w:val="0"/>
+                <w:color w:val="FFFFFF"/>
+                <w:sz w:val="17"/>
+              </w:rPr>
+              <w:t>Group</w:t>
+            </w:r>
+          </w:p>
+        </w:tc>
+        <w:tc>
+          <w:tcPr>
+            <w:tcW w:type="dxa" w:w="1662"/>
+            <w:shd w:val="clear" w:color="auto" w:fill="1B2A41"/>
+          </w:tcPr>
+          <w:p>
+            <w:r>
+              <w:rPr>
+                <w:b/>
+                <w:color w:val="FFFFFF"/>
+                <w:sz w:val="17"/>
+              </w:rPr>
+            </w:r>
+            <w:r>
+              <w:rPr>
+                <w:b/>
+                <w:i w:val="0"/>
+                <w:color w:val="FFFFFF"/>
+                <w:sz w:val="17"/>
+              </w:rPr>
+              <w:t>Today</w:t>
+            </w:r>
+          </w:p>
+        </w:tc>
+        <w:tc>
+          <w:tcPr>
+            <w:tcW w:type="dxa" w:w="1662"/>
+            <w:shd w:val="clear" w:color="auto" w:fill="1B2A41"/>
+          </w:tcPr>
+          <w:p>
+            <w:r>
+              <w:rPr>
+                <w:b/>
+                <w:color w:val="FFFFFF"/>
+                <w:sz w:val="17"/>
+              </w:rPr>
+            </w:r>
+            <w:r>
+              <w:rPr>
+                <w:b/>
+                <w:i w:val="0"/>
+                <w:color w:val="FFFFFF"/>
+                <w:sz w:val="17"/>
+              </w:rPr>
+              <w:t>1: count loans</w:t>
+            </w:r>
+          </w:p>
+        </w:tc>
+        <w:tc>
+          <w:tcPr>
+            <w:tcW w:type="dxa" w:w="1662"/>
+            <w:shd w:val="clear" w:color="auto" w:fill="1B2A41"/>
+          </w:tcPr>
+          <w:p>
+            <w:r>
+              <w:rPr>
+                <w:b/>
+                <w:color w:val="FFFFFF"/>
+                <w:sz w:val="17"/>
+              </w:rPr>
+            </w:r>
+            <w:r>
+              <w:rPr>
+                <w:b/>
+                <w:i w:val="0"/>
+                <w:color w:val="FFFFFF"/>
+                <w:sz w:val="17"/>
+              </w:rPr>
+              <w:t>1 and 2: every window</w:t>
+            </w:r>
+          </w:p>
+        </w:tc>
+        <w:tc>
+          <w:tcPr>
+            <w:tcW w:type="dxa" w:w="1662"/>
+            <w:shd w:val="clear" w:color="auto" w:fill="1B2A41"/>
+          </w:tcPr>
+          <w:p>
+            <w:r>
+              <w:rPr>
+                <w:b/>
+                <w:color w:val="FFFFFF"/>
+                <w:sz w:val="17"/>
+              </w:rPr>
+            </w:r>
+            <w:r>
+              <w:rPr>
+                <w:b/>
+                <w:i w:val="0"/>
+                <w:color w:val="FFFFFF"/>
+                <w:sz w:val="17"/>
+              </w:rPr>
+              <w:t>1 to 4</w:t>
+            </w:r>
+          </w:p>
+        </w:tc>
+        <w:tc>
+          <w:tcPr>
+            <w:tcW w:type="dxa" w:w="1662"/>
+            <w:shd w:val="clear" w:color="auto" w:fill="1B2A41"/>
+          </w:tcPr>
+          <w:p>
+            <w:r>
+              <w:rPr>
+                <w:b/>
+                <w:color w:val="FFFFFF"/>
+                <w:sz w:val="17"/>
+              </w:rPr>
+            </w:r>
+            <w:r>
+              <w:rPr>
+                <w:b/>
+                <w:i w:val="0"/>
+                <w:color w:val="FFFFFF"/>
+                <w:sz w:val="17"/>
+              </w:rPr>
+              <w:t>With default at 90 days at the window end</w:t>
+            </w:r>
+          </w:p>
+        </w:tc>
+      </w:tr>
+      <w:tr>
+        <w:tc>
+          <w:tcPr>
+            <w:tcW w:type="dxa" w:w="1662"/>
+          </w:tcPr>
+          <w:p>
+            <w:r>
+              <w:rPr>
+                <w:b w:val="0"/>
+                <w:sz w:val="17"/>
+              </w:rPr>
+            </w:r>
+            <w:r>
+              <w:rPr>
+                <w:b w:val="0"/>
+                <w:i w:val="0"/>
+                <w:sz w:val="17"/>
+              </w:rPr>
+              <w:t>Whole book</w:t>
+            </w:r>
+          </w:p>
+        </w:tc>
+        <w:tc>
+          <w:tcPr>
+            <w:tcW w:type="dxa" w:w="1662"/>
+          </w:tcPr>
+          <w:p>
+            <w:r>
+              <w:rPr>
+                <w:b w:val="0"/>
+                <w:sz w:val="17"/>
+              </w:rPr>
+            </w:r>
+            <w:r>
+              <w:rPr>
+                <w:b w:val="0"/>
+                <w:i w:val="0"/>
+                <w:sz w:val="17"/>
+              </w:rPr>
+              <w:t>33.7%</w:t>
+            </w:r>
+          </w:p>
+        </w:tc>
+        <w:tc>
+          <w:tcPr>
+            <w:tcW w:type="dxa" w:w="1662"/>
+          </w:tcPr>
+          <w:p>
+            <w:r>
+              <w:rPr>
+                <w:b w:val="0"/>
+                <w:sz w:val="17"/>
+              </w:rPr>
+            </w:r>
+            <w:r>
+              <w:rPr>
+                <w:b w:val="0"/>
+                <w:i w:val="0"/>
+                <w:sz w:val="17"/>
+              </w:rPr>
+              <w:t>34.4%</w:t>
+            </w:r>
+          </w:p>
+        </w:tc>
+        <w:tc>
+          <w:tcPr>
+            <w:tcW w:type="dxa" w:w="1662"/>
+          </w:tcPr>
+          <w:p>
+            <w:r>
+              <w:rPr>
+                <w:b w:val="0"/>
+                <w:sz w:val="17"/>
+              </w:rPr>
+            </w:r>
+            <w:r>
+              <w:rPr>
+                <w:b w:val="0"/>
+                <w:i w:val="0"/>
+                <w:sz w:val="17"/>
+              </w:rPr>
+              <w:t>29.6%</w:t>
+            </w:r>
+          </w:p>
+        </w:tc>
+        <w:tc>
+          <w:tcPr>
+            <w:tcW w:type="dxa" w:w="1662"/>
+          </w:tcPr>
+          <w:p>
+            <w:r>
+              <w:rPr>
+                <w:b w:val="0"/>
+                <w:sz w:val="17"/>
+              </w:rPr>
+            </w:r>
+            <w:r>
+              <w:rPr>
+                <w:b w:val="0"/>
+                <w:i w:val="0"/>
+                <w:sz w:val="17"/>
+              </w:rPr>
+              <w:t>29.6%</w:t>
+            </w:r>
+          </w:p>
+        </w:tc>
+        <w:tc>
+          <w:tcPr>
+            <w:tcW w:type="dxa" w:w="1662"/>
+          </w:tcPr>
+          <w:p>
+            <w:r>
+              <w:rPr>
+                <w:b w:val="0"/>
+                <w:sz w:val="17"/>
+              </w:rPr>
+            </w:r>
+            <w:r>
+              <w:rPr>
+                <w:b w:val="0"/>
+                <w:i w:val="0"/>
+                <w:sz w:val="17"/>
+              </w:rPr>
+              <w:t>47.1%</w:t>
+            </w:r>
+          </w:p>
+        </w:tc>
+      </w:tr>
+      <w:tr>
+        <w:tc>
+          <w:tcPr>
+            <w:tcW w:type="dxa" w:w="1662"/>
+          </w:tcPr>
+          <w:p>
+            <w:r>
+              <w:rPr>
+                <w:b w:val="0"/>
+                <w:sz w:val="17"/>
+              </w:rPr>
+            </w:r>
+            <w:r>
+              <w:rPr>
+                <w:b w:val="0"/>
+                <w:i w:val="0"/>
+                <w:sz w:val="17"/>
+              </w:rPr>
+              <w:t>MAIIC Industrial</w:t>
+            </w:r>
+          </w:p>
+        </w:tc>
+        <w:tc>
+          <w:tcPr>
+            <w:tcW w:type="dxa" w:w="1662"/>
+          </w:tcPr>
+          <w:p>
+            <w:r>
+              <w:rPr>
+                <w:b w:val="0"/>
+                <w:sz w:val="17"/>
+              </w:rPr>
+            </w:r>
+            <w:r>
+              <w:rPr>
+                <w:b w:val="0"/>
+                <w:i w:val="0"/>
+                <w:sz w:val="17"/>
+              </w:rPr>
+              <w:t>25.9%</w:t>
+            </w:r>
+          </w:p>
+        </w:tc>
+        <w:tc>
+          <w:tcPr>
+            <w:tcW w:type="dxa" w:w="1662"/>
+          </w:tcPr>
+          <w:p>
+            <w:r>
+              <w:rPr>
+                <w:b w:val="0"/>
+                <w:sz w:val="17"/>
+              </w:rPr>
+            </w:r>
+            <w:r>
+              <w:rPr>
+                <w:b w:val="0"/>
+                <w:i w:val="0"/>
+                <w:sz w:val="17"/>
+              </w:rPr>
+              <w:t>16.7%</w:t>
+            </w:r>
+          </w:p>
+        </w:tc>
+        <w:tc>
+          <w:tcPr>
+            <w:tcW w:type="dxa" w:w="1662"/>
+          </w:tcPr>
+          <w:p>
+            <w:r>
+              <w:rPr>
+                <w:b w:val="0"/>
+                <w:sz w:val="17"/>
+              </w:rPr>
+            </w:r>
+            <w:r>
+              <w:rPr>
+                <w:b w:val="0"/>
+                <w:i w:val="0"/>
+                <w:sz w:val="17"/>
+              </w:rPr>
+              <w:t>10.9%</w:t>
+            </w:r>
+          </w:p>
+        </w:tc>
+        <w:tc>
+          <w:tcPr>
+            <w:tcW w:type="dxa" w:w="1662"/>
+          </w:tcPr>
+          <w:p>
+            <w:r>
+              <w:rPr>
+                <w:b w:val="0"/>
+                <w:sz w:val="17"/>
+              </w:rPr>
+            </w:r>
+            <w:r>
+              <w:rPr>
+                <w:b w:val="0"/>
+                <w:i w:val="0"/>
+                <w:sz w:val="17"/>
+              </w:rPr>
+              <w:t>10.9%</w:t>
+            </w:r>
+          </w:p>
+        </w:tc>
+        <w:tc>
+          <w:tcPr>
+            <w:tcW w:type="dxa" w:w="1662"/>
+          </w:tcPr>
+          <w:p>
+            <w:r>
+              <w:rPr>
+                <w:b w:val="0"/>
+                <w:sz w:val="17"/>
+              </w:rPr>
+            </w:r>
+            <w:r>
+              <w:rPr>
+                <w:b w:val="0"/>
+                <w:i w:val="0"/>
+                <w:sz w:val="17"/>
+              </w:rPr>
+              <w:t>37.0%</w:t>
+            </w:r>
+          </w:p>
+        </w:tc>
+      </w:tr>
+      <w:tr>
+        <w:tc>
+          <w:tcPr>
+            <w:tcW w:type="dxa" w:w="1662"/>
+          </w:tcPr>
+          <w:p>
+            <w:r>
+              <w:rPr>
+                <w:b w:val="0"/>
+                <w:sz w:val="17"/>
+              </w:rPr>
+            </w:r>
+            <w:r>
+              <w:rPr>
+                <w:b w:val="0"/>
+                <w:i w:val="0"/>
+                <w:sz w:val="17"/>
+              </w:rPr>
+              <w:t>FInES Industrial</w:t>
+            </w:r>
+          </w:p>
+        </w:tc>
+        <w:tc>
+          <w:tcPr>
+            <w:tcW w:type="dxa" w:w="1662"/>
+          </w:tcPr>
+          <w:p>
+            <w:r>
+              <w:rPr>
+                <w:b w:val="0"/>
+                <w:sz w:val="17"/>
+              </w:rPr>
+            </w:r>
+            <w:r>
+              <w:rPr>
+                <w:b w:val="0"/>
+                <w:i w:val="0"/>
+                <w:sz w:val="17"/>
+              </w:rPr>
+              <w:t>44.3%</w:t>
+            </w:r>
+          </w:p>
+        </w:tc>
+        <w:tc>
+          <w:tcPr>
+            <w:tcW w:type="dxa" w:w="1662"/>
+          </w:tcPr>
+          <w:p>
+            <w:r>
+              <w:rPr>
+                <w:b w:val="0"/>
+                <w:sz w:val="17"/>
+              </w:rPr>
+            </w:r>
+            <w:r>
+              <w:rPr>
+                <w:b w:val="0"/>
+                <w:i w:val="0"/>
+                <w:sz w:val="17"/>
+              </w:rPr>
+              <w:t>30.0%</w:t>
+            </w:r>
+          </w:p>
+        </w:tc>
+        <w:tc>
+          <w:tcPr>
+            <w:tcW w:type="dxa" w:w="1662"/>
+          </w:tcPr>
+          <w:p>
+            <w:r>
+              <w:rPr>
+                <w:b w:val="0"/>
+                <w:sz w:val="17"/>
+              </w:rPr>
+            </w:r>
+            <w:r>
+              <w:rPr>
+                <w:b w:val="0"/>
+                <w:i w:val="0"/>
+                <w:sz w:val="17"/>
+              </w:rPr>
+              <w:t>21.2%</w:t>
+            </w:r>
+          </w:p>
+        </w:tc>
+        <w:tc>
+          <w:tcPr>
+            <w:tcW w:type="dxa" w:w="1662"/>
+          </w:tcPr>
+          <w:p>
+            <w:r>
+              <w:rPr>
+                <w:b w:val="0"/>
+                <w:sz w:val="17"/>
+              </w:rPr>
+            </w:r>
+            <w:r>
+              <w:rPr>
+                <w:b w:val="0"/>
+                <w:i w:val="0"/>
+                <w:sz w:val="17"/>
+              </w:rPr>
+              <w:t>21.2%</w:t>
+            </w:r>
+          </w:p>
+        </w:tc>
+        <w:tc>
+          <w:tcPr>
+            <w:tcW w:type="dxa" w:w="1662"/>
+          </w:tcPr>
+          <w:p>
+            <w:r>
+              <w:rPr>
+                <w:b w:val="0"/>
+                <w:sz w:val="17"/>
+              </w:rPr>
+            </w:r>
+            <w:r>
+              <w:rPr>
+                <w:b w:val="0"/>
+                <w:i w:val="0"/>
+                <w:sz w:val="17"/>
+              </w:rPr>
+              <w:t>38.4%</w:t>
+            </w:r>
+          </w:p>
+        </w:tc>
+      </w:tr>
+      <w:tr>
+        <w:tc>
+          <w:tcPr>
+            <w:tcW w:type="dxa" w:w="1662"/>
+          </w:tcPr>
+          <w:p>
+            <w:r>
+              <w:rPr>
+                <w:b w:val="0"/>
+                <w:sz w:val="17"/>
+              </w:rPr>
+            </w:r>
+            <w:r>
+              <w:rPr>
+                <w:b w:val="0"/>
+                <w:i w:val="0"/>
+                <w:sz w:val="17"/>
+              </w:rPr>
+              <w:t>FInES Agricultural</w:t>
+            </w:r>
+          </w:p>
+        </w:tc>
+        <w:tc>
+          <w:tcPr>
+            <w:tcW w:type="dxa" w:w="1662"/>
+          </w:tcPr>
+          <w:p>
+            <w:r>
+              <w:rPr>
+                <w:b w:val="0"/>
+                <w:sz w:val="17"/>
+              </w:rPr>
+            </w:r>
+            <w:r>
+              <w:rPr>
+                <w:b w:val="0"/>
+                <w:i w:val="0"/>
+                <w:sz w:val="17"/>
+              </w:rPr>
+              <w:t>64.6%</w:t>
+            </w:r>
+          </w:p>
+        </w:tc>
+        <w:tc>
+          <w:tcPr>
+            <w:tcW w:type="dxa" w:w="1662"/>
+          </w:tcPr>
+          <w:p>
+            <w:r>
+              <w:rPr>
+                <w:b w:val="0"/>
+                <w:sz w:val="17"/>
+              </w:rPr>
+            </w:r>
+            <w:r>
+              <w:rPr>
+                <w:b w:val="0"/>
+                <w:i w:val="0"/>
+                <w:sz w:val="17"/>
+              </w:rPr>
+              <w:t>50.0%</w:t>
+            </w:r>
+          </w:p>
+        </w:tc>
+        <w:tc>
+          <w:tcPr>
+            <w:tcW w:type="dxa" w:w="1662"/>
+          </w:tcPr>
+          <w:p>
+            <w:r>
+              <w:rPr>
+                <w:b w:val="0"/>
+                <w:sz w:val="17"/>
+              </w:rPr>
+            </w:r>
+            <w:r>
+              <w:rPr>
+                <w:b w:val="0"/>
+                <w:i w:val="0"/>
+                <w:sz w:val="17"/>
+              </w:rPr>
+              <w:t>43.9%</w:t>
+            </w:r>
+          </w:p>
+        </w:tc>
+        <w:tc>
+          <w:tcPr>
+            <w:tcW w:type="dxa" w:w="1662"/>
+          </w:tcPr>
+          <w:p>
+            <w:r>
+              <w:rPr>
+                <w:b w:val="0"/>
+                <w:sz w:val="17"/>
+              </w:rPr>
+            </w:r>
+            <w:r>
+              <w:rPr>
+                <w:b w:val="0"/>
+                <w:i w:val="0"/>
+                <w:sz w:val="17"/>
+              </w:rPr>
+              <w:t>43.9%</w:t>
+            </w:r>
+          </w:p>
+        </w:tc>
+        <w:tc>
+          <w:tcPr>
+            <w:tcW w:type="dxa" w:w="1662"/>
+          </w:tcPr>
+          <w:p>
+            <w:r>
+              <w:rPr>
+                <w:b w:val="0"/>
+                <w:sz w:val="17"/>
+              </w:rPr>
+            </w:r>
+            <w:r>
+              <w:rPr>
+                <w:b w:val="0"/>
+                <w:i w:val="0"/>
+                <w:sz w:val="17"/>
+              </w:rPr>
+              <w:t>59.2%</w:t>
+            </w:r>
+          </w:p>
+        </w:tc>
+      </w:tr>
+    </w:tbl>
+    <w:p/>
+    <w:p>
+      <w:pPr>
+        <w:spacing w:after="120"/>
+      </w:pPr>
+      <w:r>
+        <w:rPr>
+          <w:b/>
+          <w:i w:val="0"/>
+        </w:rPr>
+        <w:t>Stage 2 PD, for the same window</w:t>
+      </w:r>
+    </w:p>
+    <w:tbl>
+      <w:tblPr>
+        <w:tblStyle w:val="TableGrid"/>
+        <w:tblW w:type="auto" w:w="0"/>
+        <w:tblLook w:firstColumn="1" w:firstRow="1" w:lastColumn="0" w:lastRow="0" w:noHBand="0" w:noVBand="1" w:val="04A0"/>
+      </w:tblPr>
+      <w:tblGrid>
+        <w:gridCol w:w="1662"/>
+        <w:gridCol w:w="1662"/>
+        <w:gridCol w:w="1662"/>
+        <w:gridCol w:w="1662"/>
+        <w:gridCol w:w="1662"/>
+        <w:gridCol w:w="1662"/>
+      </w:tblGrid>
+      <w:tr>
+        <w:tc>
+          <w:tcPr>
+            <w:tcW w:type="dxa" w:w="1662"/>
+            <w:shd w:val="clear" w:color="auto" w:fill="1B2A41"/>
+          </w:tcPr>
+          <w:p>
+            <w:r>
+              <w:rPr>
+                <w:b/>
+                <w:color w:val="FFFFFF"/>
+                <w:sz w:val="17"/>
+              </w:rPr>
+            </w:r>
+            <w:r>
+              <w:rPr>
+                <w:b/>
+                <w:i w:val="0"/>
+                <w:color w:val="FFFFFF"/>
+                <w:sz w:val="17"/>
+              </w:rPr>
+              <w:t>Group</w:t>
+            </w:r>
+          </w:p>
+        </w:tc>
+        <w:tc>
+          <w:tcPr>
+            <w:tcW w:type="dxa" w:w="1662"/>
+            <w:shd w:val="clear" w:color="auto" w:fill="1B2A41"/>
+          </w:tcPr>
+          <w:p>
+            <w:r>
+              <w:rPr>
+                <w:b/>
+                <w:color w:val="FFFFFF"/>
+                <w:sz w:val="17"/>
+              </w:rPr>
+            </w:r>
+            <w:r>
+              <w:rPr>
+                <w:b/>
+                <w:i w:val="0"/>
+                <w:color w:val="FFFFFF"/>
+                <w:sz w:val="17"/>
+              </w:rPr>
+              <w:t>Today</w:t>
+            </w:r>
+          </w:p>
+        </w:tc>
+        <w:tc>
+          <w:tcPr>
+            <w:tcW w:type="dxa" w:w="1662"/>
+            <w:shd w:val="clear" w:color="auto" w:fill="1B2A41"/>
+          </w:tcPr>
+          <w:p>
+            <w:r>
+              <w:rPr>
+                <w:b/>
+                <w:color w:val="FFFFFF"/>
+                <w:sz w:val="17"/>
+              </w:rPr>
+            </w:r>
+            <w:r>
+              <w:rPr>
+                <w:b/>
+                <w:i w:val="0"/>
+                <w:color w:val="FFFFFF"/>
+                <w:sz w:val="17"/>
+              </w:rPr>
+              <w:t>1: count loans</w:t>
+            </w:r>
+          </w:p>
+        </w:tc>
+        <w:tc>
+          <w:tcPr>
+            <w:tcW w:type="dxa" w:w="1662"/>
+            <w:shd w:val="clear" w:color="auto" w:fill="1B2A41"/>
+          </w:tcPr>
+          <w:p>
+            <w:r>
+              <w:rPr>
+                <w:b/>
+                <w:color w:val="FFFFFF"/>
+                <w:sz w:val="17"/>
+              </w:rPr>
+            </w:r>
+            <w:r>
+              <w:rPr>
+                <w:b/>
+                <w:i w:val="0"/>
+                <w:color w:val="FFFFFF"/>
+                <w:sz w:val="17"/>
+              </w:rPr>
+              <w:t>1 and 2: every window</w:t>
+            </w:r>
+          </w:p>
+        </w:tc>
+        <w:tc>
+          <w:tcPr>
+            <w:tcW w:type="dxa" w:w="1662"/>
+            <w:shd w:val="clear" w:color="auto" w:fill="1B2A41"/>
+          </w:tcPr>
+          <w:p>
+            <w:r>
+              <w:rPr>
+                <w:b/>
+                <w:color w:val="FFFFFF"/>
+                <w:sz w:val="17"/>
+              </w:rPr>
+            </w:r>
+            <w:r>
+              <w:rPr>
+                <w:b/>
+                <w:i w:val="0"/>
+                <w:color w:val="FFFFFF"/>
+                <w:sz w:val="17"/>
+              </w:rPr>
+              <w:t>1 to 4</w:t>
+            </w:r>
+          </w:p>
+        </w:tc>
+        <w:tc>
+          <w:tcPr>
+            <w:tcW w:type="dxa" w:w="1662"/>
+            <w:shd w:val="clear" w:color="auto" w:fill="1B2A41"/>
+          </w:tcPr>
+          <w:p>
+            <w:r>
+              <w:rPr>
+                <w:b/>
+                <w:color w:val="FFFFFF"/>
+                <w:sz w:val="17"/>
+              </w:rPr>
+            </w:r>
+            <w:r>
+              <w:rPr>
+                <w:b/>
+                <w:i w:val="0"/>
+                <w:color w:val="FFFFFF"/>
+                <w:sz w:val="17"/>
+              </w:rPr>
+              <w:t>With default at 90 days at the window end</w:t>
+            </w:r>
+          </w:p>
+        </w:tc>
+      </w:tr>
+      <w:tr>
+        <w:tc>
+          <w:tcPr>
+            <w:tcW w:type="dxa" w:w="1662"/>
+          </w:tcPr>
+          <w:p>
+            <w:r>
+              <w:rPr>
+                <w:b w:val="0"/>
+                <w:sz w:val="17"/>
+              </w:rPr>
+            </w:r>
+            <w:r>
+              <w:rPr>
+                <w:b w:val="0"/>
+                <w:i w:val="0"/>
+                <w:sz w:val="17"/>
+              </w:rPr>
+              <w:t>Whole book</w:t>
+            </w:r>
+          </w:p>
+        </w:tc>
+        <w:tc>
+          <w:tcPr>
+            <w:tcW w:type="dxa" w:w="1662"/>
+          </w:tcPr>
+          <w:p>
+            <w:r>
+              <w:rPr>
+                <w:b w:val="0"/>
+                <w:sz w:val="17"/>
+              </w:rPr>
+            </w:r>
+            <w:r>
+              <w:rPr>
+                <w:b w:val="0"/>
+                <w:i w:val="0"/>
+                <w:sz w:val="17"/>
+              </w:rPr>
+              <w:t>26.3%</w:t>
+            </w:r>
+          </w:p>
+        </w:tc>
+        <w:tc>
+          <w:tcPr>
+            <w:tcW w:type="dxa" w:w="1662"/>
+          </w:tcPr>
+          <w:p>
+            <w:r>
+              <w:rPr>
+                <w:b w:val="0"/>
+                <w:sz w:val="17"/>
+              </w:rPr>
+            </w:r>
+            <w:r>
+              <w:rPr>
+                <w:b w:val="0"/>
+                <w:i w:val="0"/>
+                <w:sz w:val="17"/>
+              </w:rPr>
+              <w:t>45.7%</w:t>
+            </w:r>
+          </w:p>
+        </w:tc>
+        <w:tc>
+          <w:tcPr>
+            <w:tcW w:type="dxa" w:w="1662"/>
+          </w:tcPr>
+          <w:p>
+            <w:r>
+              <w:rPr>
+                <w:b w:val="0"/>
+                <w:sz w:val="17"/>
+              </w:rPr>
+            </w:r>
+            <w:r>
+              <w:rPr>
+                <w:b w:val="0"/>
+                <w:i w:val="0"/>
+                <w:sz w:val="17"/>
+              </w:rPr>
+              <w:t>56.4%</w:t>
+            </w:r>
+          </w:p>
+        </w:tc>
+        <w:tc>
+          <w:tcPr>
+            <w:tcW w:type="dxa" w:w="1662"/>
+          </w:tcPr>
+          <w:p>
+            <w:r>
+              <w:rPr>
+                <w:b w:val="0"/>
+                <w:sz w:val="17"/>
+              </w:rPr>
+            </w:r>
+            <w:r>
+              <w:rPr>
+                <w:b w:val="0"/>
+                <w:i w:val="0"/>
+                <w:sz w:val="17"/>
+              </w:rPr>
+              <w:t>56.4%</w:t>
+            </w:r>
+          </w:p>
+        </w:tc>
+        <w:tc>
+          <w:tcPr>
+            <w:tcW w:type="dxa" w:w="1662"/>
+          </w:tcPr>
+          <w:p>
+            <w:r>
+              <w:rPr>
+                <w:b w:val="0"/>
+                <w:sz w:val="17"/>
+              </w:rPr>
+            </w:r>
+            <w:r>
+              <w:rPr>
+                <w:b w:val="0"/>
+                <w:i w:val="0"/>
+                <w:sz w:val="17"/>
+              </w:rPr>
+              <w:t>72.4%</w:t>
+            </w:r>
+          </w:p>
+        </w:tc>
+      </w:tr>
+      <w:tr>
+        <w:tc>
+          <w:tcPr>
+            <w:tcW w:type="dxa" w:w="1662"/>
+          </w:tcPr>
+          <w:p>
+            <w:r>
+              <w:rPr>
+                <w:b w:val="0"/>
+                <w:sz w:val="17"/>
+              </w:rPr>
+            </w:r>
+            <w:r>
+              <w:rPr>
+                <w:b w:val="0"/>
+                <w:i w:val="0"/>
+                <w:sz w:val="17"/>
+              </w:rPr>
+              <w:t>MAIIC Industrial</w:t>
+            </w:r>
+          </w:p>
+        </w:tc>
+        <w:tc>
+          <w:tcPr>
+            <w:tcW w:type="dxa" w:w="1662"/>
+          </w:tcPr>
+          <w:p>
+            <w:r>
+              <w:rPr>
+                <w:b w:val="0"/>
+                <w:sz w:val="17"/>
+              </w:rPr>
+            </w:r>
+            <w:r>
+              <w:rPr>
+                <w:b w:val="0"/>
+                <w:i w:val="0"/>
+                <w:sz w:val="17"/>
+              </w:rPr>
+              <w:t>21.2%</w:t>
+            </w:r>
+          </w:p>
+        </w:tc>
+        <w:tc>
+          <w:tcPr>
+            <w:tcW w:type="dxa" w:w="1662"/>
+          </w:tcPr>
+          <w:p>
+            <w:r>
+              <w:rPr>
+                <w:b w:val="0"/>
+                <w:sz w:val="17"/>
+              </w:rPr>
+            </w:r>
+            <w:r>
+              <w:rPr>
+                <w:b w:val="0"/>
+                <w:i w:val="0"/>
+                <w:sz w:val="17"/>
+              </w:rPr>
+              <w:t>20.0%</w:t>
+            </w:r>
+          </w:p>
+        </w:tc>
+        <w:tc>
+          <w:tcPr>
+            <w:tcW w:type="dxa" w:w="1662"/>
+          </w:tcPr>
+          <w:p>
+            <w:r>
+              <w:rPr>
+                <w:b w:val="0"/>
+                <w:sz w:val="17"/>
+              </w:rPr>
+            </w:r>
+            <w:r>
+              <w:rPr>
+                <w:b w:val="0"/>
+                <w:i w:val="0"/>
+                <w:sz w:val="17"/>
+              </w:rPr>
+              <w:t>37.7%</w:t>
+            </w:r>
+          </w:p>
+        </w:tc>
+        <w:tc>
+          <w:tcPr>
+            <w:tcW w:type="dxa" w:w="1662"/>
+          </w:tcPr>
+          <w:p>
+            <w:r>
+              <w:rPr>
+                <w:b w:val="0"/>
+                <w:sz w:val="17"/>
+              </w:rPr>
+            </w:r>
+            <w:r>
+              <w:rPr>
+                <w:b w:val="0"/>
+                <w:i w:val="0"/>
+                <w:sz w:val="17"/>
+              </w:rPr>
+              <w:t>37.7%</w:t>
+            </w:r>
+          </w:p>
+        </w:tc>
+        <w:tc>
+          <w:tcPr>
+            <w:tcW w:type="dxa" w:w="1662"/>
+          </w:tcPr>
+          <w:p>
+            <w:r>
+              <w:rPr>
+                <w:b w:val="0"/>
+                <w:sz w:val="17"/>
+              </w:rPr>
+            </w:r>
+            <w:r>
+              <w:rPr>
+                <w:b w:val="0"/>
+                <w:i w:val="0"/>
+                <w:sz w:val="17"/>
+              </w:rPr>
+              <w:t>73.6%</w:t>
+            </w:r>
+          </w:p>
+        </w:tc>
+      </w:tr>
+      <w:tr>
+        <w:tc>
+          <w:tcPr>
+            <w:tcW w:type="dxa" w:w="1662"/>
+          </w:tcPr>
+          <w:p>
+            <w:r>
+              <w:rPr>
+                <w:b w:val="0"/>
+                <w:sz w:val="17"/>
+              </w:rPr>
+            </w:r>
+            <w:r>
+              <w:rPr>
+                <w:b w:val="0"/>
+                <w:i w:val="0"/>
+                <w:sz w:val="17"/>
+              </w:rPr>
+              <w:t>FInES Industrial</w:t>
+            </w:r>
+          </w:p>
+        </w:tc>
+        <w:tc>
+          <w:tcPr>
+            <w:tcW w:type="dxa" w:w="1662"/>
+          </w:tcPr>
+          <w:p>
+            <w:r>
+              <w:rPr>
+                <w:b w:val="0"/>
+                <w:sz w:val="17"/>
+              </w:rPr>
+            </w:r>
+            <w:r>
+              <w:rPr>
+                <w:b w:val="0"/>
+                <w:i w:val="0"/>
+                <w:sz w:val="17"/>
+              </w:rPr>
+              <w:t>35.3%</w:t>
+            </w:r>
+          </w:p>
+        </w:tc>
+        <w:tc>
+          <w:tcPr>
+            <w:tcW w:type="dxa" w:w="1662"/>
+          </w:tcPr>
+          <w:p>
+            <w:r>
+              <w:rPr>
+                <w:b w:val="0"/>
+                <w:sz w:val="17"/>
+              </w:rPr>
+            </w:r>
+            <w:r>
+              <w:rPr>
+                <w:b w:val="0"/>
+                <w:i w:val="0"/>
+                <w:sz w:val="17"/>
+              </w:rPr>
+              <w:t>50.0%</w:t>
+            </w:r>
+          </w:p>
+        </w:tc>
+        <w:tc>
+          <w:tcPr>
+            <w:tcW w:type="dxa" w:w="1662"/>
+          </w:tcPr>
+          <w:p>
+            <w:r>
+              <w:rPr>
+                <w:b w:val="0"/>
+                <w:sz w:val="17"/>
+              </w:rPr>
+            </w:r>
+            <w:r>
+              <w:rPr>
+                <w:b w:val="0"/>
+                <w:i w:val="0"/>
+                <w:sz w:val="17"/>
+              </w:rPr>
+              <w:t>52.1%</w:t>
+            </w:r>
+          </w:p>
+        </w:tc>
+        <w:tc>
+          <w:tcPr>
+            <w:tcW w:type="dxa" w:w="1662"/>
+          </w:tcPr>
+          <w:p>
+            <w:r>
+              <w:rPr>
+                <w:b w:val="0"/>
+                <w:sz w:val="17"/>
+              </w:rPr>
+            </w:r>
+            <w:r>
+              <w:rPr>
+                <w:b w:val="0"/>
+                <w:i w:val="0"/>
+                <w:sz w:val="17"/>
+              </w:rPr>
+              <w:t>52.1%</w:t>
+            </w:r>
+          </w:p>
+        </w:tc>
+        <w:tc>
+          <w:tcPr>
+            <w:tcW w:type="dxa" w:w="1662"/>
+          </w:tcPr>
+          <w:p>
+            <w:r>
+              <w:rPr>
+                <w:b w:val="0"/>
+                <w:sz w:val="17"/>
+              </w:rPr>
+            </w:r>
+            <w:r>
+              <w:rPr>
+                <w:b w:val="0"/>
+                <w:i w:val="0"/>
+                <w:sz w:val="17"/>
+              </w:rPr>
+              <w:t>70.6%</w:t>
+            </w:r>
+          </w:p>
+        </w:tc>
+      </w:tr>
+    </w:tbl>
+    <w:p/>
+    <w:p>
+      <w:pPr>
+        <w:spacing w:after="120"/>
+      </w:pPr>
+      <w:r>
+        <w:rPr>
+          <w:b w:val="0"/>
+          <w:i w:val="0"/>
+        </w:rPr>
+        <w:t>Three things stand out:</w:t>
+      </w:r>
+    </w:p>
+    <w:p>
+      <w:pPr>
+        <w:pStyle w:val="ListBullet"/>
+      </w:pPr>
+      <w:r>
+        <w:rPr>
+          <w:b/>
+          <w:i w:val="0"/>
+        </w:rPr>
+        <w:t>Changes 1 and 2 do almost all the work.</w:t>
+      </w:r>
+      <w:r>
+        <w:rPr>
+          <w:b w:val="0"/>
+          <w:i w:val="0"/>
+        </w:rPr>
+        <w:t xml:space="preserve"> Counting loans and using every window puts Stage 2 back above Stage 1 in every group, and makes the PDs far steadier.</w:t>
+      </w:r>
+    </w:p>
+    <w:p>
+      <w:pPr>
+        <w:pStyle w:val="ListBullet"/>
+      </w:pPr>
+      <w:r>
+        <w:rPr>
+          <w:b/>
+          <w:i w:val="0"/>
+        </w:rPr>
+        <w:t>Changes 3 and 4 change nothing today</w:t>
+      </w:r>
+      <w:r>
+        <w:rPr>
+          <w:b w:val="0"/>
+          <w:i w:val="0"/>
+        </w:rPr>
+        <w:t>, because, once every window is used, every group has enough loans and the stages are already in order. They stay as safety nets for a thin month, a new portfolio, or MAIIC Term, which has no Stage 1 loans of its own.</w:t>
+      </w:r>
+    </w:p>
+    <w:p>
+      <w:pPr>
+        <w:pStyle w:val="ListBullet"/>
+      </w:pPr>
+      <w:r>
+        <w:rPr>
+          <w:b/>
+          <w:i w:val="0"/>
+        </w:rPr>
+        <w:t>Change 5 is large on its own.</w:t>
+      </w:r>
+      <w:r>
+        <w:rPr>
+          <w:b w:val="0"/>
+          <w:i w:val="0"/>
+        </w:rPr>
+        <w:t xml:space="preserve"> Moving the definition of default from over 180 days to over 90 days roughly halves again the Stage 1 PD (29.6% to 47.1% for the whole book), because many loans pass 90 days and stay in arrears without reaching 181. Counted at any month-end instead of at the window's end, it is larger still (58.7%). Section 6 therefore recommends deciding it separately.</w:t>
+      </w:r>
+    </w:p>
+    <w:p>
+      <w:pPr>
+        <w:spacing w:after="120"/>
+      </w:pPr>
+      <w:r>
+        <w:rPr>
+          <w:b/>
+          <w:i w:val="0"/>
+        </w:rPr>
+        <w:t>Did the PDs predict what happened? (a backtest)</w:t>
+      </w:r>
+    </w:p>
+    <w:p>
+      <w:pPr>
+        <w:spacing w:after="120"/>
+      </w:pPr>
+      <w:r>
+        <w:rPr>
+          <w:b w:val="0"/>
+          <w:i w:val="0"/>
+        </w:rPr>
+        <w:t>For the three months where both are known, the PD each group was given, against what that group's loans actually did over the next twelve months:</w:t>
+      </w:r>
+    </w:p>
+    <w:tbl>
+      <w:tblPr>
+        <w:tblStyle w:val="TableGrid"/>
+        <w:tblW w:type="auto" w:w="0"/>
+        <w:tblLook w:firstColumn="1" w:firstRow="1" w:lastColumn="0" w:lastRow="0" w:noHBand="0" w:noVBand="1" w:val="04A0"/>
+      </w:tblPr>
+      <w:tblGrid>
+        <w:gridCol w:w="2493"/>
+        <w:gridCol w:w="2493"/>
+        <w:gridCol w:w="2493"/>
+        <w:gridCol w:w="2493"/>
+      </w:tblGrid>
+      <w:tr>
+        <w:tc>
+          <w:tcPr>
+            <w:tcW w:type="dxa" w:w="2493"/>
+            <w:shd w:val="clear" w:color="auto" w:fill="1B2A41"/>
+          </w:tcPr>
+          <w:p>
+            <w:r>
+              <w:rPr>
+                <w:b/>
+                <w:color w:val="FFFFFF"/>
+                <w:sz w:val="17"/>
+              </w:rPr>
+            </w:r>
+            <w:r>
+              <w:rPr>
+                <w:b/>
+                <w:i w:val="0"/>
+                <w:color w:val="FFFFFF"/>
+                <w:sz w:val="17"/>
+              </w:rPr>
+              <w:t>Group and stage</w:t>
+            </w:r>
+          </w:p>
+        </w:tc>
+        <w:tc>
+          <w:tcPr>
+            <w:tcW w:type="dxa" w:w="2493"/>
+            <w:shd w:val="clear" w:color="auto" w:fill="1B2A41"/>
+          </w:tcPr>
+          <w:p>
+            <w:r>
+              <w:rPr>
+                <w:b/>
+                <w:color w:val="FFFFFF"/>
+                <w:sz w:val="17"/>
+              </w:rPr>
+            </w:r>
+            <w:r>
+              <w:rPr>
+                <w:b/>
+                <w:i w:val="0"/>
+                <w:color w:val="FFFFFF"/>
+                <w:sz w:val="17"/>
+              </w:rPr>
+              <w:t>PD given (July to September 2025)</w:t>
+            </w:r>
+          </w:p>
+        </w:tc>
+        <w:tc>
+          <w:tcPr>
+            <w:tcW w:type="dxa" w:w="2493"/>
+            <w:shd w:val="clear" w:color="auto" w:fill="1B2A41"/>
+          </w:tcPr>
+          <w:p>
+            <w:r>
+              <w:rPr>
+                <w:b/>
+                <w:color w:val="FFFFFF"/>
+                <w:sz w:val="17"/>
+              </w:rPr>
+            </w:r>
+            <w:r>
+              <w:rPr>
+                <w:b/>
+                <w:i w:val="0"/>
+                <w:color w:val="FFFFFF"/>
+                <w:sz w:val="17"/>
+              </w:rPr>
+              <w:t>What happened, counting loans</w:t>
+            </w:r>
+          </w:p>
+        </w:tc>
+        <w:tc>
+          <w:tcPr>
+            <w:tcW w:type="dxa" w:w="2493"/>
+            <w:shd w:val="clear" w:color="auto" w:fill="1B2A41"/>
+          </w:tcPr>
+          <w:p>
+            <w:r>
+              <w:rPr>
+                <w:b/>
+                <w:color w:val="FFFFFF"/>
+                <w:sz w:val="17"/>
+              </w:rPr>
+            </w:r>
+            <w:r>
+              <w:rPr>
+                <w:b/>
+                <w:i w:val="0"/>
+                <w:color w:val="FFFFFF"/>
+                <w:sz w:val="17"/>
+              </w:rPr>
+              <w:t>What happened, by balance</w:t>
+            </w:r>
+          </w:p>
+        </w:tc>
+      </w:tr>
+      <w:tr>
+        <w:tc>
+          <w:tcPr>
+            <w:tcW w:type="dxa" w:w="2493"/>
+          </w:tcPr>
+          <w:p>
+            <w:r>
+              <w:rPr>
+                <w:b w:val="0"/>
+                <w:sz w:val="17"/>
+              </w:rPr>
+            </w:r>
+            <w:r>
+              <w:rPr>
+                <w:b w:val="0"/>
+                <w:i w:val="0"/>
+                <w:sz w:val="17"/>
+              </w:rPr>
+              <w:t>Whole book, Stage 1</w:t>
+            </w:r>
+          </w:p>
+        </w:tc>
+        <w:tc>
+          <w:tcPr>
+            <w:tcW w:type="dxa" w:w="2493"/>
+          </w:tcPr>
+          <w:p>
+            <w:r>
+              <w:rPr>
+                <w:b w:val="0"/>
+                <w:sz w:val="17"/>
+              </w:rPr>
+            </w:r>
+            <w:r>
+              <w:rPr>
+                <w:b w:val="0"/>
+                <w:i w:val="0"/>
+                <w:sz w:val="17"/>
+              </w:rPr>
+              <w:t>20% to 21%</w:t>
+            </w:r>
+          </w:p>
+        </w:tc>
+        <w:tc>
+          <w:tcPr>
+            <w:tcW w:type="dxa" w:w="2493"/>
+          </w:tcPr>
+          <w:p>
+            <w:r>
+              <w:rPr>
+                <w:b w:val="0"/>
+                <w:sz w:val="17"/>
+              </w:rPr>
+            </w:r>
+            <w:r>
+              <w:rPr>
+                <w:b w:val="0"/>
+                <w:i w:val="0"/>
+                <w:sz w:val="17"/>
+              </w:rPr>
+              <w:t>17%, 19%, 34%</w:t>
+            </w:r>
+          </w:p>
+        </w:tc>
+        <w:tc>
+          <w:tcPr>
+            <w:tcW w:type="dxa" w:w="2493"/>
+          </w:tcPr>
+          <w:p>
+            <w:r>
+              <w:rPr>
+                <w:b w:val="0"/>
+                <w:sz w:val="17"/>
+              </w:rPr>
+            </w:r>
+            <w:r>
+              <w:rPr>
+                <w:b w:val="0"/>
+                <w:i w:val="0"/>
+                <w:sz w:val="17"/>
+              </w:rPr>
+              <w:t>6%, 8%, 34%</w:t>
+            </w:r>
+          </w:p>
+        </w:tc>
+      </w:tr>
+      <w:tr>
+        <w:tc>
+          <w:tcPr>
+            <w:tcW w:type="dxa" w:w="2493"/>
+          </w:tcPr>
+          <w:p>
+            <w:r>
+              <w:rPr>
+                <w:b w:val="0"/>
+                <w:sz w:val="17"/>
+              </w:rPr>
+            </w:r>
+            <w:r>
+              <w:rPr>
+                <w:b w:val="0"/>
+                <w:i w:val="0"/>
+                <w:sz w:val="17"/>
+              </w:rPr>
+              <w:t>Whole book, Stage 2</w:t>
+            </w:r>
+          </w:p>
+        </w:tc>
+        <w:tc>
+          <w:tcPr>
+            <w:tcW w:type="dxa" w:w="2493"/>
+          </w:tcPr>
+          <w:p>
+            <w:r>
+              <w:rPr>
+                <w:b w:val="0"/>
+                <w:sz w:val="17"/>
+              </w:rPr>
+            </w:r>
+            <w:r>
+              <w:rPr>
+                <w:b w:val="0"/>
+                <w:i w:val="0"/>
+                <w:sz w:val="17"/>
+              </w:rPr>
+              <w:t>0%, 57%, 100%</w:t>
+            </w:r>
+          </w:p>
+        </w:tc>
+        <w:tc>
+          <w:tcPr>
+            <w:tcW w:type="dxa" w:w="2493"/>
+          </w:tcPr>
+          <w:p>
+            <w:r>
+              <w:rPr>
+                <w:b w:val="0"/>
+                <w:sz w:val="17"/>
+              </w:rPr>
+            </w:r>
+            <w:r>
+              <w:rPr>
+                <w:b w:val="0"/>
+                <w:i w:val="0"/>
+                <w:sz w:val="17"/>
+              </w:rPr>
+              <w:t>58%, 50%, 46%</w:t>
+            </w:r>
+          </w:p>
+        </w:tc>
+        <w:tc>
+          <w:tcPr>
+            <w:tcW w:type="dxa" w:w="2493"/>
+          </w:tcPr>
+          <w:p>
+            <w:r>
+              <w:rPr>
+                <w:b w:val="0"/>
+                <w:sz w:val="17"/>
+              </w:rPr>
+            </w:r>
+            <w:r>
+              <w:rPr>
+                <w:b w:val="0"/>
+                <w:i w:val="0"/>
+                <w:sz w:val="17"/>
+              </w:rPr>
+              <w:t>47%, 34%, 26%</w:t>
+            </w:r>
+          </w:p>
+        </w:tc>
+      </w:tr>
+      <w:tr>
+        <w:tc>
+          <w:tcPr>
+            <w:tcW w:type="dxa" w:w="2493"/>
+          </w:tcPr>
+          <w:p>
+            <w:r>
+              <w:rPr>
+                <w:b w:val="0"/>
+                <w:sz w:val="17"/>
+              </w:rPr>
+            </w:r>
+            <w:r>
+              <w:rPr>
+                <w:b w:val="0"/>
+                <w:i w:val="0"/>
+                <w:sz w:val="17"/>
+              </w:rPr>
+              <w:t>FInES Agricultural, Stage 1</w:t>
+            </w:r>
+          </w:p>
+        </w:tc>
+        <w:tc>
+          <w:tcPr>
+            <w:tcW w:type="dxa" w:w="2493"/>
+          </w:tcPr>
+          <w:p>
+            <w:r>
+              <w:rPr>
+                <w:b w:val="0"/>
+                <w:sz w:val="17"/>
+              </w:rPr>
+            </w:r>
+            <w:r>
+              <w:rPr>
+                <w:b w:val="0"/>
+                <w:i w:val="0"/>
+                <w:sz w:val="17"/>
+              </w:rPr>
+              <w:t>17% to 18%</w:t>
+            </w:r>
+          </w:p>
+        </w:tc>
+        <w:tc>
+          <w:tcPr>
+            <w:tcW w:type="dxa" w:w="2493"/>
+          </w:tcPr>
+          <w:p>
+            <w:r>
+              <w:rPr>
+                <w:b w:val="0"/>
+                <w:sz w:val="17"/>
+              </w:rPr>
+            </w:r>
+            <w:r>
+              <w:rPr>
+                <w:b w:val="0"/>
+                <w:i w:val="0"/>
+                <w:sz w:val="17"/>
+              </w:rPr>
+              <w:t>43%, 43%, 50%</w:t>
+            </w:r>
+          </w:p>
+        </w:tc>
+        <w:tc>
+          <w:tcPr>
+            <w:tcW w:type="dxa" w:w="2493"/>
+          </w:tcPr>
+          <w:p>
+            <w:r>
+              <w:rPr>
+                <w:b w:val="0"/>
+                <w:sz w:val="17"/>
+              </w:rPr>
+            </w:r>
+            <w:r>
+              <w:rPr>
+                <w:b w:val="0"/>
+                <w:i w:val="0"/>
+                <w:sz w:val="17"/>
+              </w:rPr>
+              <w:t>58%, 59%, 65%</w:t>
+            </w:r>
+          </w:p>
+        </w:tc>
+      </w:tr>
+      <w:tr>
+        <w:tc>
+          <w:tcPr>
+            <w:tcW w:type="dxa" w:w="2493"/>
+          </w:tcPr>
+          <w:p>
+            <w:r>
+              <w:rPr>
+                <w:b w:val="0"/>
+                <w:sz w:val="17"/>
+              </w:rPr>
+            </w:r>
+            <w:r>
+              <w:rPr>
+                <w:b w:val="0"/>
+                <w:i w:val="0"/>
+                <w:sz w:val="17"/>
+              </w:rPr>
+              <w:t>MAIIC Industrial, Stage 1</w:t>
+            </w:r>
+          </w:p>
+        </w:tc>
+        <w:tc>
+          <w:tcPr>
+            <w:tcW w:type="dxa" w:w="2493"/>
+          </w:tcPr>
+          <w:p>
+            <w:r>
+              <w:rPr>
+                <w:b w:val="0"/>
+                <w:sz w:val="17"/>
+              </w:rPr>
+            </w:r>
+            <w:r>
+              <w:rPr>
+                <w:b w:val="0"/>
+                <w:i w:val="0"/>
+                <w:sz w:val="17"/>
+              </w:rPr>
+              <w:t>20% to 21%</w:t>
+            </w:r>
+          </w:p>
+        </w:tc>
+        <w:tc>
+          <w:tcPr>
+            <w:tcW w:type="dxa" w:w="2493"/>
+          </w:tcPr>
+          <w:p>
+            <w:r>
+              <w:rPr>
+                <w:b w:val="0"/>
+                <w:sz w:val="17"/>
+              </w:rPr>
+            </w:r>
+            <w:r>
+              <w:rPr>
+                <w:b w:val="0"/>
+                <w:i w:val="0"/>
+                <w:sz w:val="17"/>
+              </w:rPr>
+              <w:t>0%, 0%, 17%</w:t>
+            </w:r>
+          </w:p>
+        </w:tc>
+        <w:tc>
+          <w:tcPr>
+            <w:tcW w:type="dxa" w:w="2493"/>
+          </w:tcPr>
+          <w:p>
+            <w:r>
+              <w:rPr>
+                <w:b w:val="0"/>
+                <w:sz w:val="17"/>
+              </w:rPr>
+            </w:r>
+            <w:r>
+              <w:rPr>
+                <w:b w:val="0"/>
+                <w:i w:val="0"/>
+                <w:sz w:val="17"/>
+              </w:rPr>
+              <w:t>0%, 0%, 26%</w:t>
+            </w:r>
+          </w:p>
+        </w:tc>
+      </w:tr>
+    </w:tbl>
+    <w:p/>
+    <w:p>
+      <w:pPr>
+        <w:spacing w:after="120"/>
+      </w:pPr>
+      <w:r>
+        <w:rPr>
+          <w:b w:val="0"/>
+          <w:i w:val="0"/>
+        </w:rPr>
+        <w:t>The Stage 2 PDs given were 0% or 100%: a group of a few loans had seen either no default or only defaults. What actually happened was about half. Counted by loans, outcomes are steady; by balance they swing with whichever large loan happened to default. The proposed figures (Stage 1 29.6%, Stage 2 56.4% for the whole book) sit close to what happened.</w:t>
+      </w:r>
+    </w:p>
+    <w:p>
+      <w:pPr>
+        <w:spacing w:after="120"/>
+      </w:pPr>
+      <w:r>
+        <w:rPr>
+          <w:b/>
+          <w:i w:val="0"/>
+        </w:rPr>
+        <w:t>The effect on the allowance (an estimate)</w:t>
+      </w:r>
+    </w:p>
+    <w:p>
+      <w:pPr>
+        <w:spacing w:after="120"/>
+      </w:pPr>
+      <w:r>
+        <w:rPr>
+          <w:b w:val="0"/>
+          <w:i w:val="0"/>
+        </w:rPr>
+        <w:t>A Stage 1 loan's allowance is proportional to its 12-month PD, so the effect on Stage 1 can be estimated by scaling each loan's booked allowance by the change in its group's PD (keeping the forward-looking adjustment on top). For MAIIC's own book at September 2026, against a booked Stage 1 allowance of K1,901.6 million:</w:t>
       </w:r>
     </w:p>
     <w:tbl>
@@ -1298,7 +3127,7 @@
                 <w:color w:val="FFFFFF"/>
                 <w:sz w:val="17"/>
               </w:rPr>
-              <w:t>Group and stage</w:t>
+              <w:t>Changes</w:t>
             </w:r>
           </w:p>
         </w:tc>
@@ -1322,7 +3151,7 @@
                 <w:color w:val="FFFFFF"/>
                 <w:sz w:val="17"/>
               </w:rPr>
-              <w:t>September 2026 as booked</w:t>
+              <w:t>Estimated Stage 1 allowance</w:t>
             </w:r>
           </w:p>
         </w:tc>
@@ -1346,7 +3175,7 @@
                 <w:color w:val="FFFFFF"/>
                 <w:sz w:val="17"/>
               </w:rPr>
-              <w:t>Counted, all windows</w:t>
+              <w:t>Change</w:t>
             </w:r>
           </w:p>
         </w:tc>
@@ -1369,7 +3198,7 @@
                 <w:i w:val="0"/>
                 <w:sz w:val="17"/>
               </w:rPr>
-              <w:t>Whole book, Stage 1</w:t>
+              <w:t>1: count loans</w:t>
             </w:r>
           </w:p>
         </w:tc>
@@ -1390,7 +3219,7 @@
                 <w:i w:val="0"/>
                 <w:sz w:val="17"/>
               </w:rPr>
-              <w:t>33.7%</w:t>
+              <w:t>K1,718.6 million</w:t>
             </w:r>
           </w:p>
         </w:tc>
@@ -1411,7 +3240,7 @@
                 <w:i w:val="0"/>
                 <w:sz w:val="17"/>
               </w:rPr>
-              <w:t>29.6%</w:t>
+              <w:t>K182.9 million lower (10%)</w:t>
             </w:r>
           </w:p>
         </w:tc>
@@ -1434,7 +3263,7 @@
                 <w:i w:val="0"/>
                 <w:sz w:val="17"/>
               </w:rPr>
-              <w:t>Whole book, Stage 2</w:t>
+              <w:t>1 and 2 (and 1 to 4)</w:t>
             </w:r>
           </w:p>
         </w:tc>
@@ -1455,7 +3284,7 @@
                 <w:i w:val="0"/>
                 <w:sz w:val="17"/>
               </w:rPr>
-              <w:t>26.3%</w:t>
+              <w:t>K1,422.3 million</w:t>
             </w:r>
           </w:p>
         </w:tc>
@@ -1476,7 +3305,7 @@
                 <w:i w:val="0"/>
                 <w:sz w:val="17"/>
               </w:rPr>
-              <w:t>56.4%</w:t>
+              <w:t>K479.3 million lower (25%)</w:t>
             </w:r>
           </w:p>
         </w:tc>
@@ -1499,7 +3328,7 @@
                 <w:i w:val="0"/>
                 <w:sz w:val="17"/>
               </w:rPr>
-              <w:t>FInES Industrial, Stage 1</w:t>
+              <w:t>1 to 4, and default at 90 days at the window end</w:t>
             </w:r>
           </w:p>
         </w:tc>
@@ -1520,7 +3349,7 @@
                 <w:i w:val="0"/>
                 <w:sz w:val="17"/>
               </w:rPr>
-              <w:t>44.3%</w:t>
+              <w:t>K2,483.5 million</w:t>
             </w:r>
           </w:p>
         </w:tc>
@@ -1541,202 +3370,7 @@
                 <w:i w:val="0"/>
                 <w:sz w:val="17"/>
               </w:rPr>
-              <w:t>21.2%</w:t>
-            </w:r>
-          </w:p>
-        </w:tc>
-      </w:tr>
-      <w:tr>
-        <w:tc>
-          <w:tcPr>
-            <w:tcW w:type="dxa" w:w="3324"/>
-          </w:tcPr>
-          <w:p>
-            <w:r>
-              <w:rPr>
-                <w:b w:val="0"/>
-                <w:sz w:val="17"/>
-              </w:rPr>
-            </w:r>
-            <w:r>
-              <w:rPr>
-                <w:b w:val="0"/>
-                <w:i w:val="0"/>
-                <w:sz w:val="17"/>
-              </w:rPr>
-              <w:t>FInES Industrial, Stage 2</w:t>
-            </w:r>
-          </w:p>
-        </w:tc>
-        <w:tc>
-          <w:tcPr>
-            <w:tcW w:type="dxa" w:w="3324"/>
-          </w:tcPr>
-          <w:p>
-            <w:r>
-              <w:rPr>
-                <w:b w:val="0"/>
-                <w:sz w:val="17"/>
-              </w:rPr>
-            </w:r>
-            <w:r>
-              <w:rPr>
-                <w:b w:val="0"/>
-                <w:i w:val="0"/>
-                <w:sz w:val="17"/>
-              </w:rPr>
-              <w:t>35.3%</w:t>
-            </w:r>
-          </w:p>
-        </w:tc>
-        <w:tc>
-          <w:tcPr>
-            <w:tcW w:type="dxa" w:w="3324"/>
-          </w:tcPr>
-          <w:p>
-            <w:r>
-              <w:rPr>
-                <w:b w:val="0"/>
-                <w:sz w:val="17"/>
-              </w:rPr>
-            </w:r>
-            <w:r>
-              <w:rPr>
-                <w:b w:val="0"/>
-                <w:i w:val="0"/>
-                <w:sz w:val="17"/>
-              </w:rPr>
-              <w:t>52.1%</w:t>
-            </w:r>
-          </w:p>
-        </w:tc>
-      </w:tr>
-      <w:tr>
-        <w:tc>
-          <w:tcPr>
-            <w:tcW w:type="dxa" w:w="3324"/>
-          </w:tcPr>
-          <w:p>
-            <w:r>
-              <w:rPr>
-                <w:b w:val="0"/>
-                <w:sz w:val="17"/>
-              </w:rPr>
-            </w:r>
-            <w:r>
-              <w:rPr>
-                <w:b w:val="0"/>
-                <w:i w:val="0"/>
-                <w:sz w:val="17"/>
-              </w:rPr>
-              <w:t>MAIIC Industrial, Stage 1</w:t>
-            </w:r>
-          </w:p>
-        </w:tc>
-        <w:tc>
-          <w:tcPr>
-            <w:tcW w:type="dxa" w:w="3324"/>
-          </w:tcPr>
-          <w:p>
-            <w:r>
-              <w:rPr>
-                <w:b w:val="0"/>
-                <w:sz w:val="17"/>
-              </w:rPr>
-            </w:r>
-            <w:r>
-              <w:rPr>
-                <w:b w:val="0"/>
-                <w:i w:val="0"/>
-                <w:sz w:val="17"/>
-              </w:rPr>
-              <w:t>25.9%</w:t>
-            </w:r>
-          </w:p>
-        </w:tc>
-        <w:tc>
-          <w:tcPr>
-            <w:tcW w:type="dxa" w:w="3324"/>
-          </w:tcPr>
-          <w:p>
-            <w:r>
-              <w:rPr>
-                <w:b w:val="0"/>
-                <w:sz w:val="17"/>
-              </w:rPr>
-            </w:r>
-            <w:r>
-              <w:rPr>
-                <w:b w:val="0"/>
-                <w:i w:val="0"/>
-                <w:sz w:val="17"/>
-              </w:rPr>
-              <w:t>10.9%</w:t>
-            </w:r>
-          </w:p>
-        </w:tc>
-      </w:tr>
-      <w:tr>
-        <w:tc>
-          <w:tcPr>
-            <w:tcW w:type="dxa" w:w="3324"/>
-          </w:tcPr>
-          <w:p>
-            <w:r>
-              <w:rPr>
-                <w:b w:val="0"/>
-                <w:sz w:val="17"/>
-              </w:rPr>
-            </w:r>
-            <w:r>
-              <w:rPr>
-                <w:b w:val="0"/>
-                <w:i w:val="0"/>
-                <w:sz w:val="17"/>
-              </w:rPr>
-              <w:t>MAIIC Industrial, Stage 2</w:t>
-            </w:r>
-          </w:p>
-        </w:tc>
-        <w:tc>
-          <w:tcPr>
-            <w:tcW w:type="dxa" w:w="3324"/>
-          </w:tcPr>
-          <w:p>
-            <w:r>
-              <w:rPr>
-                <w:b w:val="0"/>
-                <w:sz w:val="17"/>
-              </w:rPr>
-            </w:r>
-            <w:r>
-              <w:rPr>
-                <w:b w:val="0"/>
-                <w:i w:val="0"/>
-                <w:sz w:val="17"/>
-              </w:rPr>
-              <w:t>21.2%</w:t>
-            </w:r>
-          </w:p>
-        </w:tc>
-        <w:tc>
-          <w:tcPr>
-            <w:tcW w:type="dxa" w:w="3324"/>
-          </w:tcPr>
-          <w:p>
-            <w:r>
-              <w:rPr>
-                <w:b w:val="0"/>
-                <w:sz w:val="17"/>
-              </w:rPr>
-            </w:r>
-            <w:r>
-              <w:rPr>
-                <w:b w:val="0"/>
-                <w:i w:val="0"/>
-                <w:sz w:val="17"/>
-              </w:rPr>
-              <w:t>37.7%</w:t>
+              <w:t>K582.0 million higher (31%)</w:t>
             </w:r>
           </w:p>
         </w:tc>
@@ -1752,7 +3386,7 @@
           <w:b w:val="0"/>
           <w:i w:val="0"/>
         </w:rPr>
-        <w:t>Stage 2 is back above Stage 1 in every group, and Stage 1 is steadier and, for most groups, lower. These are indications only; section 7 says how the full effect on the allowance is measured before anything is decided.</w:t>
+        <w:t>Stage 2's allowance is over the loan's whole life and does not scale this way: it is measured properly only by the comparison run of section 7, which re-runs the engines. These estimates are a guide to direction and size, not booked figures.</w:t>
       </w:r>
     </w:p>
     <w:p>
@@ -2415,11 +4049,35 @@
             </w:r>
             <w:r>
               <w:rPr>
-                <w:b w:val="0"/>
+                <w:b/>
                 <w:i w:val="0"/>
                 <w:sz w:val="17"/>
               </w:rPr>
-              <w:t>Over 90 days overdue, or written off, the usual IFRS 9 and Basel definition (IFRS 9 B5.5.37)</w:t>
+              <w:t>Now: over 180 days overdue, or written off</w:t>
+            </w:r>
+            <w:r>
+              <w:rPr>
+                <w:b w:val="0"/>
+                <w:i w:val="0"/>
+                <w:sz w:val="17"/>
+              </w:rPr>
+              <w:t xml:space="preserve">, today's level, fixed so it no longer moves with the staging policy. </w:t>
+            </w:r>
+            <w:r>
+              <w:rPr>
+                <w:b/>
+                <w:i w:val="0"/>
+                <w:sz w:val="17"/>
+              </w:rPr>
+              <w:t>Separately: whether to move to over 90 days</w:t>
+            </w:r>
+            <w:r>
+              <w:rPr>
+                <w:b w:val="0"/>
+                <w:i w:val="0"/>
+                <w:sz w:val="17"/>
+              </w:rPr>
+              <w:t>, IFRS 9's rebuttable presumption (B5.5.37), decided as credit policy together with the staging decision (S1 of the Staging Module Specification)</w:t>
             </w:r>
           </w:p>
         </w:tc>
@@ -2440,7 +4098,7 @@
                 <w:i w:val="0"/>
                 <w:sz w:val="17"/>
               </w:rPr>
-              <w:t>The PD history no longer changes when the staging policy changes</w:t>
+              <w:t>Fixing the definition stops the PD history moving when the staging policy changes. Moving it to 90 days raises the Stage 1 allowance by about a third (section 5), so it is a decision of its own, not part of a calibration fix</w:t>
             </w:r>
           </w:p>
         </w:tc>
@@ -2563,7 +4221,7 @@
           <w:b w:val="0"/>
           <w:i w:val="0"/>
         </w:rPr>
-        <w:t>Changes 1 to 5 change the PDs; change 6 is a check that runs beside them. Mega Farm stays measured by its own module and is not touched.</w:t>
+        <w:t>Changes 1 and 2 change the PDs today; changes 3 and 4 are safety nets that change nothing on today's data; change 5, as recommended, fixes the definition without moving it; change 6 is a check that runs beside them. Mega Farm stays measured by its own module and is not touched.</w:t>
       </w:r>
     </w:p>
     <w:p>
@@ -3203,7 +4861,7 @@
                 <w:i w:val="0"/>
                 <w:sz w:val="17"/>
               </w:rPr>
-              <w:t>Over 90 days, or written off</w:t>
+              <w:t>Now: over 180 days, or written off, fixed apart from the staging policy. Whether to move to 90 days: decided with S1</w:t>
             </w:r>
           </w:p>
         </w:tc>

</xml_diff>